<commit_message>
docs: ER com cardinalidades 1:N/1:1 + quadros de entidades/relações no relatório e reorganizar docs em ARQUIVOS.MD
</commit_message>
<xml_diff>
--- a/docs/Relatorio_Final_Projeto_G3_UJAC.docx
+++ b/docs/Relatorio_Final_Projeto_G3_UJAC.docx
@@ -6215,7 +6215,7 @@
           <w:color w:val="6B7280"/>
           <w:lang w:val="pt-BR"/>
         </w:rPr>
-        <w:t>A solução compreende cinco módulos REST (assessments, scores, results, schedules e print) e integra-se aos serviços Core de autenticação (4101), utilizadores (4102), catálogos académicos (4103) e finanças (4104), com erros estruturados e resposta fail-closed.</w:t>
+        <w:t>A solução compreende cinco módulos REST (assessments, scores, results, schedules e print) e integra-se aos serviços Core de autenticação (4101), utilizadores (4102), catálogos académicos (4103) e finanças (4104), com erros estruturados e resposta fail-closed. As entidades do modelo estão organizadas por núcleo no Quadro 1 e os relacionamentos com as cardinalidades 1:N e 1:1 no Quadro 2.</w:t>
       </w:r>
       <w:r>
         <w:rPr>
@@ -6271,7 +6271,7 @@
           <w:color w:val="6B7280"/>
           <w:lang w:val="pt-BR"/>
         </w:rPr>
-        <w:t>O fluxo principal de utilização é ilustrado pelo diagrama seguinte, gerado no formato dbdiagram.io.</w:t>
+        <w:t>O fluxo principal de utilização é ilustrado pelo diagrama seguinte, gerado no formato dbdiagram.io. As entidades estão organizadas por módulo (faixas coloridas) e cada relação está anotada com a cardinalidade 1:N ou 1:1.</w:t>
       </w:r>
       <w:proofErr w:type="gramStart"/>
       <w:r>
@@ -6334,9 +6334,1259 @@
         <w:jc w:val="center"/>
       </w:pPr>
       <w:r>
-        <w:t>Figura 1 — Diagrama Entidade-Relacionamento (ER) do Módulo G3 no formato dbdiagram.io.</w:t>
-      </w:r>
-    </w:p>
+        <w:t>Figura 1 — Diagrama Entidade-Relacionamento (ER) do Módulo G3 no formato dbdiagram.io, com as entidades organizadas por módulo e os relacionamentos anotados com cardinalidades 1:N / 1:1.</w:t>
+      </w:r>
+    </w:p>
+    <w:p>
+      <w:r>
+        <w:t>Quadro 1 — Entidades do modelo (organizadas por núcleo). Para os detalhes de cada tabela, ver docs/ARQUIVOS.MD/dbdiagram-er-g3.md e dados reais em docs/ARQUIVOS.MD/dados-reais-teste.md.</w:t>
+      </w:r>
+    </w:p>
+    <w:tbl>
+      <w:tblPr>
+        <w:tblStyle w:val="TableGrid"/>
+        <w:tblW w:type="auto" w:w="0"/>
+        <w:tblLook w:firstColumn="1" w:firstRow="1" w:lastColumn="0" w:lastRow="0" w:noHBand="0" w:noVBand="1" w:val="04A0"/>
+      </w:tblPr>
+      <w:tblGrid>
+        <w:gridCol w:w="3120"/>
+        <w:gridCol w:w="3120"/>
+        <w:gridCol w:w="3120"/>
+      </w:tblGrid>
+      <w:tr>
+        <w:tc>
+          <w:tcPr>
+            <w:tcW w:type="dxa" w:w="3120"/>
+          </w:tcPr>
+          <w:p>
+            <w:r>
+              <w:t>Entidade</w:t>
+            </w:r>
+          </w:p>
+        </w:tc>
+        <w:tc>
+          <w:tcPr>
+            <w:tcW w:type="dxa" w:w="3120"/>
+          </w:tcPr>
+          <w:p>
+            <w:r>
+              <w:t>Núcleo / módulo</w:t>
+            </w:r>
+          </w:p>
+        </w:tc>
+        <w:tc>
+          <w:tcPr>
+            <w:tcW w:type="dxa" w:w="3120"/>
+          </w:tcPr>
+          <w:p>
+            <w:r>
+              <w:t>Função no projecto</w:t>
+            </w:r>
+          </w:p>
+        </w:tc>
+      </w:tr>
+      <w:tr>
+        <w:tc>
+          <w:tcPr>
+            <w:tcW w:type="dxa" w:w="3120"/>
+          </w:tcPr>
+          <w:p>
+            <w:r>
+              <w:t>schools</w:t>
+            </w:r>
+          </w:p>
+        </w:tc>
+        <w:tc>
+          <w:tcPr>
+            <w:tcW w:type="dxa" w:w="3120"/>
+          </w:tcPr>
+          <w:p>
+            <w:r>
+              <w:t>Core — Multi-tenancy</w:t>
+            </w:r>
+          </w:p>
+        </w:tc>
+        <w:tc>
+          <w:tcPr>
+            <w:tcW w:type="dxa" w:w="3120"/>
+          </w:tcPr>
+          <w:p>
+            <w:r>
+              <w:t>Raiz da instituição; todas as entidades herdam schoolId</w:t>
+            </w:r>
+          </w:p>
+        </w:tc>
+      </w:tr>
+      <w:tr>
+        <w:tc>
+          <w:tcPr>
+            <w:tcW w:type="dxa" w:w="3120"/>
+          </w:tcPr>
+          <w:p>
+            <w:r>
+              <w:t>users</w:t>
+            </w:r>
+          </w:p>
+        </w:tc>
+        <w:tc>
+          <w:tcPr>
+            <w:tcW w:type="dxa" w:w="3120"/>
+          </w:tcPr>
+          <w:p>
+            <w:r>
+              <w:t>Core — Auth</w:t>
+            </w:r>
+          </w:p>
+        </w:tc>
+        <w:tc>
+          <w:tcPr>
+            <w:tcW w:type="dxa" w:w="3120"/>
+          </w:tcPr>
+          <w:p>
+            <w:r>
+              <w:t>Conta de acesso (RBAC); 1:1 opcional com teacher e student</w:t>
+            </w:r>
+          </w:p>
+        </w:tc>
+      </w:tr>
+      <w:tr>
+        <w:tc>
+          <w:tcPr>
+            <w:tcW w:type="dxa" w:w="3120"/>
+          </w:tcPr>
+          <w:p>
+            <w:r>
+              <w:t>refresh_tokens</w:t>
+            </w:r>
+          </w:p>
+        </w:tc>
+        <w:tc>
+          <w:tcPr>
+            <w:tcW w:type="dxa" w:w="3120"/>
+          </w:tcPr>
+          <w:p>
+            <w:r>
+              <w:t>Core — Auth</w:t>
+            </w:r>
+          </w:p>
+        </w:tc>
+        <w:tc>
+          <w:tcPr>
+            <w:tcW w:type="dxa" w:w="3120"/>
+          </w:tcPr>
+          <w:p>
+            <w:r>
+              <w:t>Sessões de refresh token por conta</w:t>
+            </w:r>
+          </w:p>
+        </w:tc>
+      </w:tr>
+      <w:tr>
+        <w:tc>
+          <w:tcPr>
+            <w:tcW w:type="dxa" w:w="3120"/>
+          </w:tcPr>
+          <w:p>
+            <w:r>
+              <w:t>academic_years</w:t>
+            </w:r>
+          </w:p>
+        </w:tc>
+        <w:tc>
+          <w:tcPr>
+            <w:tcW w:type="dxa" w:w="3120"/>
+          </w:tcPr>
+          <w:p>
+            <w:r>
+              <w:t>Core — Académico</w:t>
+            </w:r>
+          </w:p>
+        </w:tc>
+        <w:tc>
+          <w:tcPr>
+            <w:tcW w:type="dxa" w:w="3120"/>
+          </w:tcPr>
+          <w:p>
+            <w:r>
+              <w:t>Ano lectivo (ex.: 2026)</w:t>
+            </w:r>
+          </w:p>
+        </w:tc>
+      </w:tr>
+      <w:tr>
+        <w:tc>
+          <w:tcPr>
+            <w:tcW w:type="dxa" w:w="3120"/>
+          </w:tcPr>
+          <w:p>
+            <w:r>
+              <w:t>terms</w:t>
+            </w:r>
+          </w:p>
+        </w:tc>
+        <w:tc>
+          <w:tcPr>
+            <w:tcW w:type="dxa" w:w="3120"/>
+          </w:tcPr>
+          <w:p>
+            <w:r>
+              <w:t>Core — Académico</w:t>
+            </w:r>
+          </w:p>
+        </w:tc>
+        <w:tc>
+          <w:tcPr>
+            <w:tcW w:type="dxa" w:w="3120"/>
+          </w:tcPr>
+          <w:p>
+            <w:r>
+              <w:t>Período/trimestre (ex.: 1.º Trimestre)</w:t>
+            </w:r>
+          </w:p>
+        </w:tc>
+      </w:tr>
+      <w:tr>
+        <w:tc>
+          <w:tcPr>
+            <w:tcW w:type="dxa" w:w="3120"/>
+          </w:tcPr>
+          <w:p>
+            <w:r>
+              <w:t>classes</w:t>
+            </w:r>
+          </w:p>
+        </w:tc>
+        <w:tc>
+          <w:tcPr>
+            <w:tcW w:type="dxa" w:w="3120"/>
+          </w:tcPr>
+          <w:p>
+            <w:r>
+              <w:t>Core — Académico</w:t>
+            </w:r>
+          </w:p>
+        </w:tc>
+        <w:tc>
+          <w:tcPr>
+            <w:tcW w:type="dxa" w:w="3120"/>
+          </w:tcPr>
+          <w:p>
+            <w:r>
+              <w:t>Turma (ex.: Eng. Informática — 1.º Ano)</w:t>
+            </w:r>
+          </w:p>
+        </w:tc>
+      </w:tr>
+      <w:tr>
+        <w:tc>
+          <w:tcPr>
+            <w:tcW w:type="dxa" w:w="3120"/>
+          </w:tcPr>
+          <w:p>
+            <w:r>
+              <w:t>subjects</w:t>
+            </w:r>
+          </w:p>
+        </w:tc>
+        <w:tc>
+          <w:tcPr>
+            <w:tcW w:type="dxa" w:w="3120"/>
+          </w:tcPr>
+          <w:p>
+            <w:r>
+              <w:t>Core — Académico</w:t>
+            </w:r>
+          </w:p>
+        </w:tc>
+        <w:tc>
+          <w:tcPr>
+            <w:tcW w:type="dxa" w:w="3120"/>
+          </w:tcPr>
+          <w:p>
+            <w:r>
+              <w:t>Disciplina lectiva</w:t>
+            </w:r>
+          </w:p>
+        </w:tc>
+      </w:tr>
+      <w:tr>
+        <w:tc>
+          <w:tcPr>
+            <w:tcW w:type="dxa" w:w="3120"/>
+          </w:tcPr>
+          <w:p>
+            <w:r>
+              <w:t>teachers</w:t>
+            </w:r>
+          </w:p>
+        </w:tc>
+        <w:tc>
+          <w:tcPr>
+            <w:tcW w:type="dxa" w:w="3120"/>
+          </w:tcPr>
+          <w:p>
+            <w:r>
+              <w:t>Core — Teachers (4102)</w:t>
+            </w:r>
+          </w:p>
+        </w:tc>
+        <w:tc>
+          <w:tcPr>
+            <w:tcW w:type="dxa" w:w="3120"/>
+          </w:tcPr>
+          <w:p>
+            <w:r>
+              <w:t>Professor responsável por avaliações e aulas</w:t>
+            </w:r>
+          </w:p>
+        </w:tc>
+      </w:tr>
+      <w:tr>
+        <w:tc>
+          <w:tcPr>
+            <w:tcW w:type="dxa" w:w="3120"/>
+          </w:tcPr>
+          <w:p>
+            <w:r>
+              <w:t>students</w:t>
+            </w:r>
+          </w:p>
+        </w:tc>
+        <w:tc>
+          <w:tcPr>
+            <w:tcW w:type="dxa" w:w="3120"/>
+          </w:tcPr>
+          <w:p>
+            <w:r>
+              <w:t>Core — Students (4101)</w:t>
+            </w:r>
+          </w:p>
+        </w:tc>
+        <w:tc>
+          <w:tcPr>
+            <w:tcW w:type="dxa" w:w="3120"/>
+          </w:tcPr>
+          <w:p>
+            <w:r>
+              <w:t>Aluno; dono de notas e resultados</w:t>
+            </w:r>
+          </w:p>
+        </w:tc>
+      </w:tr>
+      <w:tr>
+        <w:tc>
+          <w:tcPr>
+            <w:tcW w:type="dxa" w:w="3120"/>
+          </w:tcPr>
+          <w:p>
+            <w:r>
+              <w:t>enrollments</w:t>
+            </w:r>
+          </w:p>
+        </w:tc>
+        <w:tc>
+          <w:tcPr>
+            <w:tcW w:type="dxa" w:w="3120"/>
+          </w:tcPr>
+          <w:p>
+            <w:r>
+              <w:t>Core — Enrolments (4103)</w:t>
+            </w:r>
+          </w:p>
+        </w:tc>
+        <w:tc>
+          <w:tcPr>
+            <w:tcW w:type="dxa" w:w="3120"/>
+          </w:tcPr>
+          <w:p>
+            <w:r>
+              <w:t>Matrícula (aluno × turma × disciplina × período)</w:t>
+            </w:r>
+          </w:p>
+        </w:tc>
+      </w:tr>
+      <w:tr>
+        <w:tc>
+          <w:tcPr>
+            <w:tcW w:type="dxa" w:w="3120"/>
+          </w:tcPr>
+          <w:p>
+            <w:r>
+              <w:t>assessments</w:t>
+            </w:r>
+          </w:p>
+        </w:tc>
+        <w:tc>
+          <w:tcPr>
+            <w:tcW w:type="dxa" w:w="3120"/>
+          </w:tcPr>
+          <w:p>
+            <w:r>
+              <w:t>Módulo G3</w:t>
+            </w:r>
+          </w:p>
+        </w:tc>
+        <w:tc>
+          <w:tcPr>
+            <w:tcW w:type="dxa" w:w="3120"/>
+          </w:tcPr>
+          <w:p>
+            <w:r>
+              <w:t>Avaliação (teste, exame, projecto) da turma e disciplina</w:t>
+            </w:r>
+          </w:p>
+        </w:tc>
+      </w:tr>
+      <w:tr>
+        <w:tc>
+          <w:tcPr>
+            <w:tcW w:type="dxa" w:w="3120"/>
+          </w:tcPr>
+          <w:p>
+            <w:r>
+              <w:t>grades</w:t>
+            </w:r>
+          </w:p>
+        </w:tc>
+        <w:tc>
+          <w:tcPr>
+            <w:tcW w:type="dxa" w:w="3120"/>
+          </w:tcPr>
+          <w:p>
+            <w:r>
+              <w:t>Módulo G3</w:t>
+            </w:r>
+          </w:p>
+        </w:tc>
+        <w:tc>
+          <w:tcPr>
+            <w:tcW w:type="dxa" w:w="3120"/>
+          </w:tcPr>
+          <w:p>
+            <w:r>
+              <w:t>Nota (0..maxScore) de um aluno numa avaliação</w:t>
+            </w:r>
+          </w:p>
+        </w:tc>
+      </w:tr>
+      <w:tr>
+        <w:tc>
+          <w:tcPr>
+            <w:tcW w:type="dxa" w:w="3120"/>
+          </w:tcPr>
+          <w:p>
+            <w:r>
+              <w:t>schedules</w:t>
+            </w:r>
+          </w:p>
+        </w:tc>
+        <w:tc>
+          <w:tcPr>
+            <w:tcW w:type="dxa" w:w="3120"/>
+          </w:tcPr>
+          <w:p>
+            <w:r>
+              <w:t>Módulo G3</w:t>
+            </w:r>
+          </w:p>
+        </w:tc>
+        <w:tc>
+          <w:tcPr>
+            <w:tcW w:type="dxa" w:w="3120"/>
+          </w:tcPr>
+          <w:p>
+            <w:r>
+              <w:t>Aula do horário (dia da semana, HH:mm, sala)</w:t>
+            </w:r>
+          </w:p>
+        </w:tc>
+      </w:tr>
+      <w:tr>
+        <w:tc>
+          <w:tcPr>
+            <w:tcW w:type="dxa" w:w="3120"/>
+          </w:tcPr>
+          <w:p>
+            <w:r>
+              <w:t>results</w:t>
+            </w:r>
+          </w:p>
+        </w:tc>
+        <w:tc>
+          <w:tcPr>
+            <w:tcW w:type="dxa" w:w="3120"/>
+          </w:tcPr>
+          <w:p>
+            <w:r>
+              <w:t>Módulo G3</w:t>
+            </w:r>
+          </w:p>
+        </w:tc>
+        <w:tc>
+          <w:tcPr>
+            <w:tcW w:type="dxa" w:w="3120"/>
+          </w:tcPr>
+          <w:p>
+            <w:r>
+              <w:t>Resultado final (média ponderada) do aluno</w:t>
+            </w:r>
+          </w:p>
+        </w:tc>
+      </w:tr>
+      <w:tr>
+        <w:tc>
+          <w:tcPr>
+            <w:tcW w:type="dxa" w:w="3120"/>
+          </w:tcPr>
+          <w:p>
+            <w:r>
+              <w:t>financial_statuses</w:t>
+            </w:r>
+          </w:p>
+        </w:tc>
+        <w:tc>
+          <w:tcPr>
+            <w:tcW w:type="dxa" w:w="3120"/>
+          </w:tcPr>
+          <w:p>
+            <w:r>
+              <w:t>Core — Finance (4104)</w:t>
+            </w:r>
+          </w:p>
+        </w:tc>
+        <w:tc>
+          <w:tcPr>
+            <w:tcW w:type="dxa" w:w="3120"/>
+          </w:tcPr>
+          <w:p>
+            <w:r>
+              <w:t>Situação financeira do aluno (1:1)</w:t>
+            </w:r>
+          </w:p>
+        </w:tc>
+      </w:tr>
+      <w:tr>
+        <w:tc>
+          <w:tcPr>
+            <w:tcW w:type="dxa" w:w="3120"/>
+          </w:tcPr>
+          <w:p>
+            <w:r>
+              <w:t>audit_logs</w:t>
+            </w:r>
+          </w:p>
+        </w:tc>
+        <w:tc>
+          <w:tcPr>
+            <w:tcW w:type="dxa" w:w="3120"/>
+          </w:tcPr>
+          <w:p>
+            <w:r>
+              <w:t>Core — Auditoria</w:t>
+            </w:r>
+          </w:p>
+        </w:tc>
+        <w:tc>
+          <w:tcPr>
+            <w:tcW w:type="dxa" w:w="3120"/>
+          </w:tcPr>
+          <w:p>
+            <w:r>
+              <w:t>Registo de operações para evidência</w:t>
+            </w:r>
+          </w:p>
+        </w:tc>
+      </w:tr>
+    </w:tbl>
+    <w:p>
+      <w:r>
+        <w:t>Quadro 2 — Relacionamentos e cardinalidades (1:N, 1:1) entre as entidades.</w:t>
+      </w:r>
+    </w:p>
+    <w:tbl>
+      <w:tblPr>
+        <w:tblStyle w:val="TableGrid"/>
+        <w:tblW w:type="auto" w:w="0"/>
+        <w:tblLook w:firstColumn="1" w:firstRow="1" w:lastColumn="0" w:lastRow="0" w:noHBand="0" w:noVBand="1" w:val="04A0"/>
+      </w:tblPr>
+      <w:tblGrid>
+        <w:gridCol w:w="3120"/>
+        <w:gridCol w:w="3120"/>
+        <w:gridCol w:w="3120"/>
+      </w:tblGrid>
+      <w:tr>
+        <w:tc>
+          <w:tcPr>
+            <w:tcW w:type="dxa" w:w="3120"/>
+          </w:tcPr>
+          <w:p>
+            <w:r>
+              <w:t>Relacionamento</w:t>
+            </w:r>
+          </w:p>
+        </w:tc>
+        <w:tc>
+          <w:tcPr>
+            <w:tcW w:type="dxa" w:w="3120"/>
+          </w:tcPr>
+          <w:p>
+            <w:r>
+              <w:t>Cardinalidade</w:t>
+            </w:r>
+          </w:p>
+        </w:tc>
+        <w:tc>
+          <w:tcPr>
+            <w:tcW w:type="dxa" w:w="3120"/>
+          </w:tcPr>
+          <w:p>
+            <w:r>
+              <w:t>Explicação</w:t>
+            </w:r>
+          </w:p>
+        </w:tc>
+      </w:tr>
+      <w:tr>
+        <w:tc>
+          <w:tcPr>
+            <w:tcW w:type="dxa" w:w="3120"/>
+          </w:tcPr>
+          <w:p>
+            <w:r>
+              <w:t>schools → users</w:t>
+            </w:r>
+          </w:p>
+        </w:tc>
+        <w:tc>
+          <w:tcPr>
+            <w:tcW w:type="dxa" w:w="3120"/>
+          </w:tcPr>
+          <w:p>
+            <w:r>
+              <w:t>1:N</w:t>
+            </w:r>
+          </w:p>
+        </w:tc>
+        <w:tc>
+          <w:tcPr>
+            <w:tcW w:type="dxa" w:w="3120"/>
+          </w:tcPr>
+          <w:p>
+            <w:r>
+              <w:t>Uma escola tem muitos utilizadores</w:t>
+            </w:r>
+          </w:p>
+        </w:tc>
+      </w:tr>
+      <w:tr>
+        <w:tc>
+          <w:tcPr>
+            <w:tcW w:type="dxa" w:w="3120"/>
+          </w:tcPr>
+          <w:p>
+            <w:r>
+              <w:t>users → refresh_tokens</w:t>
+            </w:r>
+          </w:p>
+        </w:tc>
+        <w:tc>
+          <w:tcPr>
+            <w:tcW w:type="dxa" w:w="3120"/>
+          </w:tcPr>
+          <w:p>
+            <w:r>
+              <w:t>1:N</w:t>
+            </w:r>
+          </w:p>
+        </w:tc>
+        <w:tc>
+          <w:tcPr>
+            <w:tcW w:type="dxa" w:w="3120"/>
+          </w:tcPr>
+          <w:p>
+            <w:r>
+              <w:t>Uma conta tem várias sessões</w:t>
+            </w:r>
+          </w:p>
+        </w:tc>
+      </w:tr>
+      <w:tr>
+        <w:tc>
+          <w:tcPr>
+            <w:tcW w:type="dxa" w:w="3120"/>
+          </w:tcPr>
+          <w:p>
+            <w:r>
+              <w:t>users → teachers</w:t>
+            </w:r>
+          </w:p>
+        </w:tc>
+        <w:tc>
+          <w:tcPr>
+            <w:tcW w:type="dxa" w:w="3120"/>
+          </w:tcPr>
+          <w:p>
+            <w:r>
+              <w:t>1:1</w:t>
+            </w:r>
+          </w:p>
+        </w:tc>
+        <w:tc>
+          <w:tcPr>
+            <w:tcW w:type="dxa" w:w="3120"/>
+          </w:tcPr>
+          <w:p>
+            <w:r>
+              <w:t>Conta opcional do professor (userId UQ)</w:t>
+            </w:r>
+          </w:p>
+        </w:tc>
+      </w:tr>
+      <w:tr>
+        <w:tc>
+          <w:tcPr>
+            <w:tcW w:type="dxa" w:w="3120"/>
+          </w:tcPr>
+          <w:p>
+            <w:r>
+              <w:t>users → students</w:t>
+            </w:r>
+          </w:p>
+        </w:tc>
+        <w:tc>
+          <w:tcPr>
+            <w:tcW w:type="dxa" w:w="3120"/>
+          </w:tcPr>
+          <w:p>
+            <w:r>
+              <w:t>1:1</w:t>
+            </w:r>
+          </w:p>
+        </w:tc>
+        <w:tc>
+          <w:tcPr>
+            <w:tcW w:type="dxa" w:w="3120"/>
+          </w:tcPr>
+          <w:p>
+            <w:r>
+              <w:t>Conta opcional do aluno (userId UQ)</w:t>
+            </w:r>
+          </w:p>
+        </w:tc>
+      </w:tr>
+      <w:tr>
+        <w:tc>
+          <w:tcPr>
+            <w:tcW w:type="dxa" w:w="3120"/>
+          </w:tcPr>
+          <w:p>
+            <w:r>
+              <w:t>academic_years → terms</w:t>
+            </w:r>
+          </w:p>
+        </w:tc>
+        <w:tc>
+          <w:tcPr>
+            <w:tcW w:type="dxa" w:w="3120"/>
+          </w:tcPr>
+          <w:p>
+            <w:r>
+              <w:t>1:N</w:t>
+            </w:r>
+          </w:p>
+        </w:tc>
+        <w:tc>
+          <w:tcPr>
+            <w:tcW w:type="dxa" w:w="3120"/>
+          </w:tcPr>
+          <w:p>
+            <w:r>
+              <w:t>Um ano lectivo tem vários períodos</w:t>
+            </w:r>
+          </w:p>
+        </w:tc>
+      </w:tr>
+      <w:tr>
+        <w:tc>
+          <w:tcPr>
+            <w:tcW w:type="dxa" w:w="3120"/>
+          </w:tcPr>
+          <w:p>
+            <w:r>
+              <w:t>teachers → assessments</w:t>
+            </w:r>
+          </w:p>
+        </w:tc>
+        <w:tc>
+          <w:tcPr>
+            <w:tcW w:type="dxa" w:w="3120"/>
+          </w:tcPr>
+          <w:p>
+            <w:r>
+              <w:t>1:N</w:t>
+            </w:r>
+          </w:p>
+        </w:tc>
+        <w:tc>
+          <w:tcPr>
+            <w:tcW w:type="dxa" w:w="3120"/>
+          </w:tcPr>
+          <w:p>
+            <w:r>
+              <w:t>Um professor cria várias avaliações</w:t>
+            </w:r>
+          </w:p>
+        </w:tc>
+      </w:tr>
+      <w:tr>
+        <w:tc>
+          <w:tcPr>
+            <w:tcW w:type="dxa" w:w="3120"/>
+          </w:tcPr>
+          <w:p>
+            <w:r>
+              <w:t>teachers → schedules</w:t>
+            </w:r>
+          </w:p>
+        </w:tc>
+        <w:tc>
+          <w:tcPr>
+            <w:tcW w:type="dxa" w:w="3120"/>
+          </w:tcPr>
+          <w:p>
+            <w:r>
+              <w:t>1:N</w:t>
+            </w:r>
+          </w:p>
+        </w:tc>
+        <w:tc>
+          <w:tcPr>
+            <w:tcW w:type="dxa" w:w="3120"/>
+          </w:tcPr>
+          <w:p>
+            <w:r>
+              <w:t>Um professor tem várias aulas</w:t>
+            </w:r>
+          </w:p>
+        </w:tc>
+      </w:tr>
+      <w:tr>
+        <w:tc>
+          <w:tcPr>
+            <w:tcW w:type="dxa" w:w="3120"/>
+          </w:tcPr>
+          <w:p>
+            <w:r>
+              <w:t>classes → enrollments</w:t>
+            </w:r>
+          </w:p>
+        </w:tc>
+        <w:tc>
+          <w:tcPr>
+            <w:tcW w:type="dxa" w:w="3120"/>
+          </w:tcPr>
+          <w:p>
+            <w:r>
+              <w:t>1:N</w:t>
+            </w:r>
+          </w:p>
+        </w:tc>
+        <w:tc>
+          <w:tcPr>
+            <w:tcW w:type="dxa" w:w="3120"/>
+          </w:tcPr>
+          <w:p>
+            <w:r>
+              <w:t>Uma turma tem vários alunos matriculados</w:t>
+            </w:r>
+          </w:p>
+        </w:tc>
+      </w:tr>
+      <w:tr>
+        <w:tc>
+          <w:tcPr>
+            <w:tcW w:type="dxa" w:w="3120"/>
+          </w:tcPr>
+          <w:p>
+            <w:r>
+              <w:t>classes → assessments</w:t>
+            </w:r>
+          </w:p>
+        </w:tc>
+        <w:tc>
+          <w:tcPr>
+            <w:tcW w:type="dxa" w:w="3120"/>
+          </w:tcPr>
+          <w:p>
+            <w:r>
+              <w:t>1:N</w:t>
+            </w:r>
+          </w:p>
+        </w:tc>
+        <w:tc>
+          <w:tcPr>
+            <w:tcW w:type="dxa" w:w="3120"/>
+          </w:tcPr>
+          <w:p>
+            <w:r>
+              <w:t>Uma turma tem várias avaliações</w:t>
+            </w:r>
+          </w:p>
+        </w:tc>
+      </w:tr>
+      <w:tr>
+        <w:tc>
+          <w:tcPr>
+            <w:tcW w:type="dxa" w:w="3120"/>
+          </w:tcPr>
+          <w:p>
+            <w:r>
+              <w:t>classes → schedules</w:t>
+            </w:r>
+          </w:p>
+        </w:tc>
+        <w:tc>
+          <w:tcPr>
+            <w:tcW w:type="dxa" w:w="3120"/>
+          </w:tcPr>
+          <w:p>
+            <w:r>
+              <w:t>1:N</w:t>
+            </w:r>
+          </w:p>
+        </w:tc>
+        <w:tc>
+          <w:tcPr>
+            <w:tcW w:type="dxa" w:w="3120"/>
+          </w:tcPr>
+          <w:p>
+            <w:r>
+              <w:t>Uma turma tem várias aulas no horário</w:t>
+            </w:r>
+          </w:p>
+        </w:tc>
+      </w:tr>
+      <w:tr>
+        <w:tc>
+          <w:tcPr>
+            <w:tcW w:type="dxa" w:w="3120"/>
+          </w:tcPr>
+          <w:p>
+            <w:r>
+              <w:t>classes → results</w:t>
+            </w:r>
+          </w:p>
+        </w:tc>
+        <w:tc>
+          <w:tcPr>
+            <w:tcW w:type="dxa" w:w="3120"/>
+          </w:tcPr>
+          <w:p>
+            <w:r>
+              <w:t>1:N</w:t>
+            </w:r>
+          </w:p>
+        </w:tc>
+        <w:tc>
+          <w:tcPr>
+            <w:tcW w:type="dxa" w:w="3120"/>
+          </w:tcPr>
+          <w:p>
+            <w:r>
+              <w:t>Uma turma tem resultados por disciplina</w:t>
+            </w:r>
+          </w:p>
+        </w:tc>
+      </w:tr>
+      <w:tr>
+        <w:tc>
+          <w:tcPr>
+            <w:tcW w:type="dxa" w:w="3120"/>
+          </w:tcPr>
+          <w:p>
+            <w:r>
+              <w:t>subjects → assessments</w:t>
+            </w:r>
+          </w:p>
+        </w:tc>
+        <w:tc>
+          <w:tcPr>
+            <w:tcW w:type="dxa" w:w="3120"/>
+          </w:tcPr>
+          <w:p>
+            <w:r>
+              <w:t>1:N</w:t>
+            </w:r>
+          </w:p>
+        </w:tc>
+        <w:tc>
+          <w:tcPr>
+            <w:tcW w:type="dxa" w:w="3120"/>
+          </w:tcPr>
+          <w:p>
+            <w:r>
+              <w:t>Uma disciplina tem várias avaliações</w:t>
+            </w:r>
+          </w:p>
+        </w:tc>
+      </w:tr>
+      <w:tr>
+        <w:tc>
+          <w:tcPr>
+            <w:tcW w:type="dxa" w:w="3120"/>
+          </w:tcPr>
+          <w:p>
+            <w:r>
+              <w:t>subjects → schedules</w:t>
+            </w:r>
+          </w:p>
+        </w:tc>
+        <w:tc>
+          <w:tcPr>
+            <w:tcW w:type="dxa" w:w="3120"/>
+          </w:tcPr>
+          <w:p>
+            <w:r>
+              <w:t>1:N</w:t>
+            </w:r>
+          </w:p>
+        </w:tc>
+        <w:tc>
+          <w:tcPr>
+            <w:tcW w:type="dxa" w:w="3120"/>
+          </w:tcPr>
+          <w:p>
+            <w:r>
+              <w:t>Uma disciplina aparece em várias aulas</w:t>
+            </w:r>
+          </w:p>
+        </w:tc>
+      </w:tr>
+      <w:tr>
+        <w:tc>
+          <w:tcPr>
+            <w:tcW w:type="dxa" w:w="3120"/>
+          </w:tcPr>
+          <w:p>
+            <w:r>
+              <w:t>subjects → results</w:t>
+            </w:r>
+          </w:p>
+        </w:tc>
+        <w:tc>
+          <w:tcPr>
+            <w:tcW w:type="dxa" w:w="3120"/>
+          </w:tcPr>
+          <w:p>
+            <w:r>
+              <w:t>1:N</w:t>
+            </w:r>
+          </w:p>
+        </w:tc>
+        <w:tc>
+          <w:tcPr>
+            <w:tcW w:type="dxa" w:w="3120"/>
+          </w:tcPr>
+          <w:p>
+            <w:r>
+              <w:t>Uma disciplina tem resultados por turma</w:t>
+            </w:r>
+          </w:p>
+        </w:tc>
+      </w:tr>
+      <w:tr>
+        <w:tc>
+          <w:tcPr>
+            <w:tcW w:type="dxa" w:w="3120"/>
+          </w:tcPr>
+          <w:p>
+            <w:r>
+              <w:t>assessments → grades</w:t>
+            </w:r>
+          </w:p>
+        </w:tc>
+        <w:tc>
+          <w:tcPr>
+            <w:tcW w:type="dxa" w:w="3120"/>
+          </w:tcPr>
+          <w:p>
+            <w:r>
+              <w:t>1:N</w:t>
+            </w:r>
+          </w:p>
+        </w:tc>
+        <w:tc>
+          <w:tcPr>
+            <w:tcW w:type="dxa" w:w="3120"/>
+          </w:tcPr>
+          <w:p>
+            <w:r>
+              <w:t>Uma avaliação tem uma nota por aluno (UQ)</w:t>
+            </w:r>
+          </w:p>
+        </w:tc>
+      </w:tr>
+      <w:tr>
+        <w:tc>
+          <w:tcPr>
+            <w:tcW w:type="dxa" w:w="3120"/>
+          </w:tcPr>
+          <w:p>
+            <w:r>
+              <w:t>students → grades</w:t>
+            </w:r>
+          </w:p>
+        </w:tc>
+        <w:tc>
+          <w:tcPr>
+            <w:tcW w:type="dxa" w:w="3120"/>
+          </w:tcPr>
+          <w:p>
+            <w:r>
+              <w:t>1:N</w:t>
+            </w:r>
+          </w:p>
+        </w:tc>
+        <w:tc>
+          <w:tcPr>
+            <w:tcW w:type="dxa" w:w="3120"/>
+          </w:tcPr>
+          <w:p>
+            <w:r>
+              <w:t>Um aluno tem notas em várias avaliações</w:t>
+            </w:r>
+          </w:p>
+        </w:tc>
+      </w:tr>
+      <w:tr>
+        <w:tc>
+          <w:tcPr>
+            <w:tcW w:type="dxa" w:w="3120"/>
+          </w:tcPr>
+          <w:p>
+            <w:r>
+              <w:t>students → enrollments</w:t>
+            </w:r>
+          </w:p>
+        </w:tc>
+        <w:tc>
+          <w:tcPr>
+            <w:tcW w:type="dxa" w:w="3120"/>
+          </w:tcPr>
+          <w:p>
+            <w:r>
+              <w:t>1:N</w:t>
+            </w:r>
+          </w:p>
+        </w:tc>
+        <w:tc>
+          <w:tcPr>
+            <w:tcW w:type="dxa" w:w="3120"/>
+          </w:tcPr>
+          <w:p>
+            <w:r>
+              <w:t>Um aluno participa em várias matrículas</w:t>
+            </w:r>
+          </w:p>
+        </w:tc>
+      </w:tr>
+      <w:tr>
+        <w:tc>
+          <w:tcPr>
+            <w:tcW w:type="dxa" w:w="3120"/>
+          </w:tcPr>
+          <w:p>
+            <w:r>
+              <w:t>students → financial_statuses</w:t>
+            </w:r>
+          </w:p>
+        </w:tc>
+        <w:tc>
+          <w:tcPr>
+            <w:tcW w:type="dxa" w:w="3120"/>
+          </w:tcPr>
+          <w:p>
+            <w:r>
+              <w:t>1:1</w:t>
+            </w:r>
+          </w:p>
+        </w:tc>
+        <w:tc>
+          <w:tcPr>
+            <w:tcW w:type="dxa" w:w="3120"/>
+          </w:tcPr>
+          <w:p>
+            <w:r>
+              <w:t>Situação financeira (studentId UQ)</w:t>
+            </w:r>
+          </w:p>
+        </w:tc>
+      </w:tr>
+      <w:tr>
+        <w:tc>
+          <w:tcPr>
+            <w:tcW w:type="dxa" w:w="3120"/>
+          </w:tcPr>
+          <w:p>
+            <w:r>
+              <w:t>students → results</w:t>
+            </w:r>
+          </w:p>
+        </w:tc>
+        <w:tc>
+          <w:tcPr>
+            <w:tcW w:type="dxa" w:w="3120"/>
+          </w:tcPr>
+          <w:p>
+            <w:r>
+              <w:t>1:N</w:t>
+            </w:r>
+          </w:p>
+        </w:tc>
+        <w:tc>
+          <w:tcPr>
+            <w:tcW w:type="dxa" w:w="3120"/>
+          </w:tcPr>
+          <w:p>
+            <w:r>
+              <w:t>Um aluno tem resultados por disciplina e período</w:t>
+            </w:r>
+          </w:p>
+        </w:tc>
+      </w:tr>
+      <w:tr>
+        <w:tc>
+          <w:tcPr>
+            <w:tcW w:type="dxa" w:w="3120"/>
+          </w:tcPr>
+          <w:p>
+            <w:r>
+              <w:t>terms → assessments</w:t>
+            </w:r>
+          </w:p>
+        </w:tc>
+        <w:tc>
+          <w:tcPr>
+            <w:tcW w:type="dxa" w:w="3120"/>
+          </w:tcPr>
+          <w:p>
+            <w:r>
+              <w:t>1:N</w:t>
+            </w:r>
+          </w:p>
+        </w:tc>
+        <w:tc>
+          <w:tcPr>
+            <w:tcW w:type="dxa" w:w="3120"/>
+          </w:tcPr>
+          <w:p>
+            <w:r>
+              <w:t>Um período tem várias avaliações</w:t>
+            </w:r>
+          </w:p>
+        </w:tc>
+      </w:tr>
+    </w:tbl>
     <w:tbl>
       <w:tblPr>
         <w:tblStyle w:val="TableGrid"/>

</xml_diff>